<commit_message>
Publish SAF impact evidence and updated CV
</commit_message>
<xml_diff>
--- a/downloads/Changmin-Jiang-CV.docx
+++ b/downloads/Changmin-Jiang-CV.docx
@@ -2885,8 +2885,179 @@
           <w:b/>
           <w:i/>
         </w:rPr>
+        <w:t>Selected Research Impact and External Use</w:t>
+      </w:r>
+    </w:p>
+    <w:p>
+      <w:pPr>
+        <w:pStyle w:val="Default"/>
+        <w:numPr>
+          <w:ilvl w:val="0"/>
+          <w:numId w:val="18"/>
+        </w:numPr>
+        <w:spacing w:after="120"/>
+        <w:jc w:val="both"/>
+      </w:pPr>
+      <w:r>
+        <w:t>Recent SAF research uptake. Seven SAF papers published in 2025–2026 had received approximately 87 provisional public citations by 16 August 2026; a unified dated Scopus export should replace this snapshot before external assessment.</w:t>
+      </w:r>
+      <w:r>
+        <w:t xml:space="preserve"> </w:t>
+      </w:r>
+      <w:hyperlink r:id="rId19">
+        <w:r>
+          <w:rPr>
+            <w:color w:val="0563C1"/>
+            <w:u w:val="single"/>
+          </w:rPr>
+          <w:t>Impact evidence page</w:t>
+        </w:r>
+      </w:hyperlink>
+    </w:p>
+    <w:p>
+      <w:pPr>
+        <w:pStyle w:val="Default"/>
+        <w:numPr>
+          <w:ilvl w:val="0"/>
+          <w:numId w:val="18"/>
+        </w:numPr>
+        <w:spacing w:after="120"/>
+        <w:jc w:val="both"/>
+      </w:pPr>
+      <w:r>
+        <w:t>Independent multi-strand use. A 2026 European SAF market study drew on three programme strands: SAF in CORSIA, comparison of four production pathways, and e-fuel mandate design.</w:t>
+      </w:r>
+      <w:r>
+        <w:t xml:space="preserve"> </w:t>
+      </w:r>
+      <w:hyperlink r:id="rId20">
+        <w:r>
+          <w:rPr>
+            <w:color w:val="0563C1"/>
+            <w:u w:val="single"/>
+          </w:rPr>
+          <w:t>Transport Policy 183 (2026), 104158</w:t>
+        </w:r>
+      </w:hyperlink>
+    </w:p>
+    <w:p>
+      <w:pPr>
+        <w:pStyle w:val="Default"/>
+        <w:numPr>
+          <w:ilvl w:val="0"/>
+          <w:numId w:val="18"/>
+        </w:numPr>
+        <w:spacing w:after="120"/>
+        <w:jc w:val="both"/>
+      </w:pPr>
+      <w:r>
+        <w:t>Formal analytical use. The Airbus-hosted EU GOLIAT deliverable used Jiang and Yang's (2021) finding that SAF quotas can, under certain conditions, outperform a carbon tax when defining techno-economic scenario targets (pp. 19–20).</w:t>
+      </w:r>
+      <w:r>
+        <w:t xml:space="preserve"> </w:t>
+      </w:r>
+      <w:hyperlink r:id="rId21">
+        <w:r>
+          <w:rPr>
+            <w:color w:val="0563C1"/>
+            <w:u w:val="single"/>
+          </w:rPr>
+          <w:t>GOLIAT D8.1</w:t>
+        </w:r>
+      </w:hyperlink>
+    </w:p>
+    <w:p>
+      <w:pPr>
+        <w:pStyle w:val="Default"/>
+        <w:numPr>
+          <w:ilvl w:val="0"/>
+          <w:numId w:val="18"/>
+        </w:numPr>
+        <w:spacing w:after="120"/>
+        <w:jc w:val="both"/>
+      </w:pPr>
+      <w:r>
+        <w:t>International policy evidence. The European Commission's 2026 EU ETS impact assessment cited Kang, Liao, Jiang and D'Alfonso's synthetic-control evaluation in its aviation analysis (p. 236); the OECD's 2025 systematic ex-post climate-policy review included the same study in its transport-sector evidence base (pp. 86–87).</w:t>
+      </w:r>
+      <w:r>
+        <w:t xml:space="preserve"> </w:t>
+      </w:r>
+      <w:hyperlink r:id="rId22">
+        <w:r>
+          <w:rPr>
+            <w:color w:val="0563C1"/>
+            <w:u w:val="single"/>
+          </w:rPr>
+          <w:t>European Commission record</w:t>
+        </w:r>
+      </w:hyperlink>
+    </w:p>
+    <w:p>
+      <w:pPr>
+        <w:pStyle w:val="Default"/>
+        <w:numPr>
+          <w:ilvl w:val="0"/>
+          <w:numId w:val="18"/>
+        </w:numPr>
+        <w:spacing w:after="120"/>
+        <w:jc w:val="both"/>
+      </w:pPr>
+      <w:r>
+        <w:t>Decision-facing and peer reach. The July 2026 Beijing SAF conference connected over 120 delegates from more than 50 institutions through industry forums, closed-door roundtables, academic sessions and site visits; Beihang separately reported more than 150 experts and scholars. SAF mandate research received the 2024 JTTRI Best Paper Award, and broader aviation-decarbonisation work received the 2026 ACCSA Best Paper Award.</w:t>
+      </w:r>
+      <w:r>
+        <w:t xml:space="preserve"> </w:t>
+      </w:r>
+      <w:hyperlink r:id="rId23">
+        <w:r>
+          <w:rPr>
+            <w:color w:val="0563C1"/>
+            <w:u w:val="single"/>
+          </w:rPr>
+          <w:t>Official ATRS awards</w:t>
+        </w:r>
+      </w:hyperlink>
+    </w:p>
+    <w:p>
+      <w:pPr>
+        <w:pStyle w:val="Default"/>
+        <w:spacing w:after="120"/>
+        <w:jc w:val="both"/>
+        <w:rPr>
+          <w:b/>
+          <w:i/>
+        </w:rPr>
+      </w:pPr>
+      <w:r>
+        <w:rPr>
+          <w:b/>
+          <w:i/>
+        </w:rPr>
         <w:t>Acknowledgements from Bibliometric Studies</w:t>
       </w:r>
+    </w:p>
+    <w:p>
+      <w:pPr>
+        <w:pStyle w:val="Default"/>
+        <w:numPr>
+          <w:ilvl w:val="0"/>
+          <w:numId w:val="18"/>
+        </w:numPr>
+        <w:spacing w:after="120"/>
+        <w:jc w:val="both"/>
+      </w:pPr>
+      <w:r>
+        <w:t xml:space="preserve">“No. 9 among 2,429 authors by bibliographic-coupling total link strength (16,568) in a Web of Science analysis of 910 SAF publications” in Kılınç, Z. N. (2026). A Structural Analysis of the Sustainable Aviation Fuel Literature Through a VOSviewer-Based Bibliometric Approach. Samsun Aviation and Aeronautical Research Journal, 2(1), 47–63. This is a knowledge-structure measure, not a citation or productivity ranking. </w:t>
+      </w:r>
+      <w:hyperlink r:id="rId24">
+        <w:r>
+          <w:rPr>
+            <w:color w:val="0563C1"/>
+            <w:u w:val="single"/>
+          </w:rPr>
+          <w:t>Source</w:t>
+        </w:r>
+      </w:hyperlink>
     </w:p>
     <w:p>
       <w:pPr>
@@ -31278,6 +31449,21 @@
           <w:i/>
         </w:rPr>
         <w:t>IISE Transactions</w:t>
+      </w:r>
+      <w:r>
+        <w:rPr>
+          <w:rFonts w:ascii="Times New Roman" w:hAnsi="Times New Roman"/>
+          <w:i/>
+        </w:rPr>
+        <w:t xml:space="preserve">; Transportation Science; </w:t>
+      </w:r>
+      <w:r>
+        <w:rPr>
+          <w:rFonts w:ascii="Times New Roman" w:hAnsi="Times New Roman"/>
+          <w:i/>
+          <w:lang w:eastAsia="zh-CN"/>
+        </w:rPr>
+        <w:t>Applied Economics</w:t>
       </w:r>
     </w:p>
     <w:p>

</xml_diff>

<commit_message>
Highlight ACCSA committee service and strengthen impact evidence
</commit_message>
<xml_diff>
--- a/downloads/Changmin-Jiang-CV.docx
+++ b/downloads/Changmin-Jiang-CV.docx
@@ -2791,6 +2791,53 @@
           <w:b/>
           <w:bCs/>
         </w:rPr>
+        <w:t>Australia-China Cooperation for Sustainable Aviation (ACCSA)</w:t>
+      </w:r>
+    </w:p>
+    <w:p>
+      <w:pPr>
+        <w:autoSpaceDE w:val="0"/>
+        <w:autoSpaceDN w:val="0"/>
+        <w:adjustRightInd w:val="0"/>
+        <w:spacing w:after="120"/>
+        <w:ind w:left="420"/>
+        <w:jc w:val="both"/>
+      </w:pPr>
+      <w:r>
+        <w:t xml:space="preserve">Scientific Committee Member, ACCSA-linked </w:t>
+      </w:r>
+      <w:hyperlink r:id="rId21">
+        <w:r>
+          <w:rPr>
+            <w:color w:val="05635B"/>
+            <w:u w:val="single"/>
+            <w:i/>
+            <w:sz w:val="23"/>
+            <w:szCs w:val="23"/>
+          </w:rPr>
+          <w:t>Economics &amp; Politics special issue ‘Political Economy of Sustainable Aviation Fuel’</w:t>
+        </w:r>
+      </w:hyperlink>
+      <w:r>
+        <w:t>, 2026-present</w:t>
+      </w:r>
+    </w:p>
+    <w:p>
+      <w:pPr>
+        <w:autoSpaceDE w:val="0"/>
+        <w:autoSpaceDN w:val="0"/>
+        <w:adjustRightInd w:val="0"/>
+        <w:jc w:val="both"/>
+        <w:rPr>
+          <w:b/>
+          <w:bCs/>
+        </w:rPr>
+      </w:pPr>
+      <w:r>
+        <w:rPr>
+          <w:b/>
+          <w:bCs/>
+        </w:rPr>
         <w:t xml:space="preserve">World Transport Convention (CTS) </w:t>
       </w:r>
       <w:r>
@@ -2899,20 +2946,14 @@
         <w:jc w:val="both"/>
       </w:pPr>
       <w:r>
-        <w:t>Recent SAF research uptake. Seven SAF papers published in 2025–2026 had received approximately 87 provisional public citations by 16 August 2026; a unified dated Scopus export should replace this snapshot before external assessment.</w:t>
-      </w:r>
-      <w:r>
-        <w:t xml:space="preserve"> </w:t>
-      </w:r>
-      <w:hyperlink r:id="rId19">
-        <w:r>
-          <w:rPr>
-            <w:color w:val="0563C1"/>
-            <w:u w:val="single"/>
-          </w:rPr>
-          <w:t>Impact evidence page</w:t>
-        </w:r>
-      </w:hyperlink>
+        <w:t xml:space="preserve">2024 </w:t>
+      </w:r>
+      <w:r>
+        <w:t>Top 2% Stanford-Elsevier Scientists - Logistics and Transportation</w:t>
+      </w:r>
+      <w:r>
+        <w:t>, Operations Research, Economics</w:t>
+      </w:r>
     </w:p>
     <w:p>
       <w:pPr>
@@ -2925,20 +2966,32 @@
         <w:jc w:val="both"/>
       </w:pPr>
       <w:r>
-        <w:t>Independent multi-strand use. A 2026 European SAF market study drew on three programme strands: SAF in CORSIA, comparison of four production pathways, and e-fuel mandate design.</w:t>
-      </w:r>
-      <w:r>
-        <w:t xml:space="preserve"> </w:t>
-      </w:r>
-      <w:hyperlink r:id="rId20">
-        <w:r>
-          <w:rPr>
-            <w:color w:val="0563C1"/>
-            <w:u w:val="single"/>
-          </w:rPr>
-          <w:t>Transport Policy 183 (2026), 104158</w:t>
-        </w:r>
-      </w:hyperlink>
+        <w:t xml:space="preserve">“No. 9 among 2,429 authors by bibliographic-coupling total link strength (16,568) in a Web of Science analysis of 910 SAF publications” in </w:t>
+      </w:r>
+    </w:p>
+    <w:p>
+      <w:pPr>
+        <w:pStyle w:val="Default"/>
+        <w:spacing w:after="120"/>
+        <w:ind w:left="360"/>
+        <w:jc w:val="both"/>
+      </w:pPr>
+      <w:proofErr w:type="spellStart"/>
+      <w:r>
+        <w:t>Kılınç</w:t>
+      </w:r>
+      <w:proofErr w:type="spellEnd"/>
+      <w:r>
+        <w:t xml:space="preserve">, Z. N. (2026). A Structural Analysis of the Sustainable Aviation Fuel Literature Through a </w:t>
+      </w:r>
+      <w:proofErr w:type="spellStart"/>
+      <w:r>
+        <w:t>VOSviewer</w:t>
+      </w:r>
+      <w:proofErr w:type="spellEnd"/>
+      <w:r>
+        <w:t xml:space="preserve">-Based Bibliometric Approach. Samsun Aviation and Aeronautical Research Journal, 2(1), 47–63. </w:t>
+      </w:r>
     </w:p>
     <w:p>
       <w:pPr>
@@ -2951,20 +3004,42 @@
         <w:jc w:val="both"/>
       </w:pPr>
       <w:r>
-        <w:t>Formal analytical use. The Airbus-hosted EU GOLIAT deliverable used Jiang and Yang's (2021) finding that SAF quotas can, under certain conditions, outperform a carbon tax when defining techno-economic scenario targets (pp. 19–20).</w:t>
-      </w:r>
-      <w:r>
-        <w:t xml:space="preserve"> </w:t>
-      </w:r>
-      <w:hyperlink r:id="rId21">
-        <w:r>
-          <w:rPr>
-            <w:color w:val="0563C1"/>
-            <w:u w:val="single"/>
-          </w:rPr>
-          <w:t>GOLIAT D8.1</w:t>
-        </w:r>
-      </w:hyperlink>
+        <w:t xml:space="preserve">“No.2 in the Top 10 Most Productive Authors in Competition between HSR and Air” in </w:t>
+      </w:r>
+    </w:p>
+    <w:p>
+      <w:pPr>
+        <w:pStyle w:val="Default"/>
+        <w:spacing w:after="120"/>
+        <w:ind w:left="360"/>
+        <w:jc w:val="both"/>
+      </w:pPr>
+      <w:proofErr w:type="spellStart"/>
+      <w:r>
+        <w:t>Iulio</w:t>
+      </w:r>
+      <w:proofErr w:type="spellEnd"/>
+      <w:r>
+        <w:t xml:space="preserve">, G., Bashir, T., &amp; Pagliara, F. (2025, April). Systematic Literature Review of 23 Years of Competition Between HSR and AIR: Methodologies and Research Gaps. In </w:t>
+      </w:r>
+      <w:r>
+        <w:rPr>
+          <w:i/>
+          <w:iCs/>
+        </w:rPr>
+        <w:t xml:space="preserve">Socioeconomic </w:t>
+      </w:r>
+      <w:r>
+        <w:rPr>
+          <w:i/>
+          <w:iCs/>
+        </w:rPr>
+        <w:lastRenderedPageBreak/>
+        <w:t>Impacts of High-Speed Rail Systems: Proceedings of the 4th International Workshop on High-Speed Rail Socioeconomic Impacts</w:t>
+      </w:r>
+      <w:r>
+        <w:t>, University of Naples Federico II, Italy, International Union of Railways (UIC), 10-11 September 2024 (p. 59). Springer Nature.</w:t>
+      </w:r>
     </w:p>
     <w:p>
       <w:pPr>
@@ -2977,20 +3052,66 @@
         <w:jc w:val="both"/>
       </w:pPr>
       <w:r>
-        <w:t>International policy evidence. The European Commission's 2026 EU ETS impact assessment cited Kang, Liao, Jiang and D'Alfonso's synthetic-control evaluation in its aviation analysis (p. 236); the OECD's 2025 systematic ex-post climate-policy review included the same study in its transport-sector evidence base (pp. 86–87).</w:t>
-      </w:r>
-      <w:r>
-        <w:t xml:space="preserve"> </w:t>
-      </w:r>
-      <w:hyperlink r:id="rId22">
-        <w:r>
-          <w:rPr>
-            <w:color w:val="0563C1"/>
-            <w:u w:val="single"/>
-          </w:rPr>
-          <w:t>European Commission record</w:t>
-        </w:r>
-      </w:hyperlink>
+        <w:t xml:space="preserve">“Top 15 Most Influential Articles in the </w:t>
+      </w:r>
+      <w:r>
+        <w:rPr>
+          <w:rFonts w:hint="eastAsia"/>
+        </w:rPr>
+        <w:t>F</w:t>
+      </w:r>
+      <w:r>
+        <w:t xml:space="preserve">ield of Airport Capacity Management” in </w:t>
+      </w:r>
+    </w:p>
+    <w:p>
+      <w:pPr>
+        <w:pStyle w:val="Default"/>
+        <w:spacing w:after="120"/>
+        <w:ind w:left="360"/>
+        <w:jc w:val="both"/>
+      </w:pPr>
+      <w:r>
+        <w:rPr>
+          <w:lang w:val="fr-FR"/>
+        </w:rPr>
+        <w:t xml:space="preserve">Dixit, A., &amp; </w:t>
+      </w:r>
+      <w:proofErr w:type="spellStart"/>
+      <w:r>
+        <w:rPr>
+          <w:lang w:val="fr-FR"/>
+        </w:rPr>
+        <w:t>Jakhar</w:t>
+      </w:r>
+      <w:proofErr w:type="spellEnd"/>
+      <w:r>
+        <w:rPr>
+          <w:lang w:val="fr-FR"/>
+        </w:rPr>
+        <w:t xml:space="preserve">, S. K. (2021). </w:t>
+      </w:r>
+      <w:r>
+        <w:t>Airport capacity management: A review and bibliometric analysis. </w:t>
+      </w:r>
+      <w:r>
+        <w:rPr>
+          <w:i/>
+        </w:rPr>
+        <w:t>Journal of Air Transport Management</w:t>
+      </w:r>
+      <w:r>
+        <w:t>, 91, 102010.</w:t>
+      </w:r>
+      <w:r>
+        <w:t xml:space="preserve"> (for the paper </w:t>
+      </w:r>
+      <w:r>
+        <w:t>“Effects of High-speed Rail and Airline Cooperation under Hub Airport Capacity Constraint”</w:t>
+      </w:r>
+      <w:r>
+        <w:t>)</w:t>
+      </w:r>
     </w:p>
     <w:p>
       <w:pPr>
@@ -3003,37 +3124,59 @@
         <w:jc w:val="both"/>
       </w:pPr>
       <w:r>
-        <w:t>Decision-facing and peer reach. The July 2026 Beijing SAF conference connected over 120 delegates from more than 50 institutions through industry forums, closed-door roundtables, academic sessions and site visits; Beihang separately reported more than 150 experts and scholars. SAF mandate research received the 2024 JTTRI Best Paper Award, and broader aviation-decarbonisation work received the 2026 ACCSA Best Paper Award.</w:t>
-      </w:r>
-      <w:r>
-        <w:t xml:space="preserve"> </w:t>
-      </w:r>
-      <w:hyperlink r:id="rId23">
-        <w:r>
-          <w:rPr>
-            <w:color w:val="0563C1"/>
-            <w:u w:val="single"/>
-          </w:rPr>
-          <w:t>Official ATRS awards</w:t>
-        </w:r>
-      </w:hyperlink>
+        <w:t>“Top 10 P</w:t>
+      </w:r>
+      <w:r>
+        <w:t xml:space="preserve">roductive </w:t>
+      </w:r>
+      <w:r>
+        <w:t>A</w:t>
+      </w:r>
+      <w:r>
+        <w:t>uthors of HSR-</w:t>
+      </w:r>
+      <w:r>
+        <w:t>R</w:t>
+      </w:r>
+      <w:r>
+        <w:t xml:space="preserve">elated </w:t>
+      </w:r>
+      <w:r>
+        <w:t>A</w:t>
+      </w:r>
+      <w:r>
+        <w:t>rticles</w:t>
+      </w:r>
+      <w:r>
+        <w:t xml:space="preserve">” in </w:t>
+      </w:r>
     </w:p>
     <w:p>
       <w:pPr>
         <w:pStyle w:val="Default"/>
         <w:spacing w:after="120"/>
-        <w:jc w:val="both"/>
-        <w:rPr>
-          <w:b/>
-          <w:i/>
-        </w:rPr>
-      </w:pPr>
-      <w:r>
-        <w:rPr>
-          <w:b/>
-          <w:i/>
-        </w:rPr>
-        <w:t>Acknowledgements from Bibliometric Studies</w:t>
+        <w:ind w:left="360"/>
+        <w:jc w:val="both"/>
+      </w:pPr>
+      <w:r>
+        <w:t xml:space="preserve">Chen, X., &amp; Liu, Y. (2020). Visualization analysis of high-speed railway research based on </w:t>
+      </w:r>
+      <w:proofErr w:type="spellStart"/>
+      <w:r>
+        <w:t>CiteSpace</w:t>
+      </w:r>
+      <w:proofErr w:type="spellEnd"/>
+      <w:r>
+        <w:t>. </w:t>
+      </w:r>
+      <w:r>
+        <w:rPr>
+          <w:i/>
+        </w:rPr>
+        <w:t>Transport Policy</w:t>
+      </w:r>
+      <w:r>
+        <w:t>, 85, 1-17.</w:t>
       </w:r>
     </w:p>
     <w:p>
@@ -3045,19 +3188,39 @@
         </w:numPr>
         <w:spacing w:after="120"/>
         <w:jc w:val="both"/>
-      </w:pPr>
-      <w:r>
-        <w:t xml:space="preserve">“No. 9 among 2,429 authors by bibliographic-coupling total link strength (16,568) in a Web of Science analysis of 910 SAF publications” in Kılınç, Z. N. (2026). A Structural Analysis of the Sustainable Aviation Fuel Literature Through a VOSviewer-Based Bibliometric Approach. Samsun Aviation and Aeronautical Research Journal, 2(1), 47–63. This is a knowledge-structure measure, not a citation or productivity ranking. </w:t>
-      </w:r>
-      <w:hyperlink r:id="rId24">
-        <w:r>
-          <w:rPr>
-            <w:color w:val="0563C1"/>
-            <w:u w:val="single"/>
-          </w:rPr>
-          <w:t>Source</w:t>
-        </w:r>
-      </w:hyperlink>
+        <w:rPr>
+          <w:color w:val="auto"/>
+        </w:rPr>
+      </w:pPr>
+      <w:r>
+        <w:rPr>
+          <w:color w:val="auto"/>
+        </w:rPr>
+        <w:t>“Top 9 Core Authors in Aviation Research” in</w:t>
+      </w:r>
+    </w:p>
+    <w:p>
+      <w:pPr>
+        <w:pStyle w:val="Default"/>
+        <w:spacing w:after="120"/>
+        <w:ind w:left="360"/>
+        <w:jc w:val="both"/>
+      </w:pPr>
+      <w:r>
+        <w:t xml:space="preserve">Wang, F., Huang, J., </w:t>
+      </w:r>
+      <w:r>
+        <w:t>&amp;</w:t>
+      </w:r>
+      <w:r>
+        <w:t xml:space="preserve"> Han, Y. (2018). </w:t>
+      </w:r>
+      <w:r>
+        <w:t xml:space="preserve">How Aviation and Maritime Research Connect or Differ from Each Other? </w:t>
+      </w:r>
+      <w:r>
+        <w:t xml:space="preserve">Working paper, Sun Yat-sen University. </w:t>
+      </w:r>
     </w:p>
     <w:p>
       <w:pPr>
@@ -3070,14 +3233,31 @@
         <w:jc w:val="both"/>
       </w:pPr>
       <w:r>
-        <w:t xml:space="preserve">2024 </w:t>
-      </w:r>
-      <w:r>
-        <w:t>Top 2% Stanford-Elsevier Scientists - Logistics and Transportation</w:t>
-      </w:r>
-      <w:r>
-        <w:t>, Operations Research, Economics</w:t>
-      </w:r>
+        <w:t xml:space="preserve">Formal analytical use. The Airbus-hosted EU GOLIAT deliverable used Jiang and Yang's (2021) finding that SAF quotas can, under certain conditions, outperform a carbon tax when defining techno-economic scenario targets (pp. 19–20). </w:t>
+      </w:r>
+      <w:hyperlink r:id="rId9">
+        <w:r>
+          <w:rPr>
+            <w:color w:val="0563C1"/>
+            <w:u w:val="single"/>
+          </w:rPr>
+          <w:t>GOLIAT</w:t>
+        </w:r>
+        <w:r>
+          <w:rPr>
+            <w:color w:val="0563C1"/>
+            <w:u w:val="single"/>
+          </w:rPr>
+          <w:t xml:space="preserve"> </w:t>
+        </w:r>
+        <w:r>
+          <w:rPr>
+            <w:color w:val="0563C1"/>
+            <w:u w:val="single"/>
+          </w:rPr>
+          <w:t>D8.1</w:t>
+        </w:r>
+      </w:hyperlink>
     </w:p>
     <w:p>
       <w:pPr>
@@ -3090,219 +3270,31 @@
         <w:jc w:val="both"/>
       </w:pPr>
       <w:r>
-        <w:t xml:space="preserve">“No.2 in the Top 10 Most Productive Authors in Competition between HSR and Air” in </w:t>
-      </w:r>
-    </w:p>
-    <w:p>
-      <w:pPr>
-        <w:pStyle w:val="Default"/>
-        <w:spacing w:after="120"/>
-        <w:ind w:left="360"/>
-        <w:jc w:val="both"/>
-      </w:pPr>
-      <w:proofErr w:type="spellStart"/>
-      <w:r>
-        <w:t>Iulio</w:t>
-      </w:r>
-      <w:proofErr w:type="spellEnd"/>
-      <w:r>
-        <w:t xml:space="preserve">, G., Bashir, T., &amp; Pagliara, F. (2025, April). Systematic Literature Review of 23 Years of Competition Between HSR and AIR: Methodologies and Research Gaps. In </w:t>
-      </w:r>
-      <w:r>
-        <w:rPr>
-          <w:i/>
-          <w:iCs/>
-        </w:rPr>
-        <w:t>Socioeconomic Impacts of High-Speed Rail Systems: Proceedings of the 4th International Workshop on High-Speed Rail Socioeconomic Impacts</w:t>
-      </w:r>
-      <w:r>
-        <w:t>, University of Naples Federico II, Italy, International Union of Railways (UIC), 10-11 September 2024 (p. 59). Springer Nature.</w:t>
-      </w:r>
-    </w:p>
-    <w:p>
-      <w:pPr>
-        <w:pStyle w:val="Default"/>
-        <w:numPr>
-          <w:ilvl w:val="0"/>
-          <w:numId w:val="18"/>
-        </w:numPr>
-        <w:spacing w:after="120"/>
-        <w:jc w:val="both"/>
-      </w:pPr>
-      <w:r>
-        <w:t xml:space="preserve">“Top 15 Most Influential Articles in the </w:t>
-      </w:r>
-      <w:r>
-        <w:rPr>
-          <w:rFonts w:hint="eastAsia"/>
-        </w:rPr>
-        <w:t>F</w:t>
-      </w:r>
-      <w:r>
-        <w:t xml:space="preserve">ield of Airport Capacity Management” in </w:t>
-      </w:r>
-    </w:p>
-    <w:p>
-      <w:pPr>
-        <w:pStyle w:val="Default"/>
-        <w:spacing w:after="120"/>
-        <w:ind w:left="360"/>
-        <w:jc w:val="both"/>
-      </w:pPr>
-      <w:r>
-        <w:rPr>
-          <w:lang w:val="fr-FR"/>
-        </w:rPr>
-        <w:t xml:space="preserve">Dixit, A., &amp; </w:t>
-      </w:r>
-      <w:proofErr w:type="spellStart"/>
-      <w:r>
-        <w:rPr>
-          <w:lang w:val="fr-FR"/>
-        </w:rPr>
-        <w:t>Jakhar</w:t>
-      </w:r>
-      <w:proofErr w:type="spellEnd"/>
-      <w:r>
-        <w:rPr>
-          <w:lang w:val="fr-FR"/>
-        </w:rPr>
-        <w:t xml:space="preserve">, S. K. (2021). </w:t>
-      </w:r>
-      <w:r>
-        <w:t xml:space="preserve">Airport capacity management: A review and bibliometric </w:t>
-      </w:r>
-      <w:r>
-        <w:lastRenderedPageBreak/>
-        <w:t>analysis. </w:t>
-      </w:r>
-      <w:r>
-        <w:rPr>
-          <w:i/>
-        </w:rPr>
-        <w:t>Journal of Air Transport Management</w:t>
-      </w:r>
-      <w:r>
-        <w:t>, 91, 102010.</w:t>
-      </w:r>
-      <w:r>
-        <w:t xml:space="preserve"> (for the paper </w:t>
-      </w:r>
-      <w:r>
-        <w:t>“Effects of High-speed Rail and Airline Cooperation under Hub Airport Capacity Constraint”</w:t>
-      </w:r>
-      <w:r>
-        <w:t>)</w:t>
-      </w:r>
-    </w:p>
-    <w:p>
-      <w:pPr>
-        <w:pStyle w:val="Default"/>
-        <w:numPr>
-          <w:ilvl w:val="0"/>
-          <w:numId w:val="18"/>
-        </w:numPr>
-        <w:spacing w:after="120"/>
-        <w:jc w:val="both"/>
-      </w:pPr>
-      <w:r>
-        <w:t>“Top 10 P</w:t>
-      </w:r>
-      <w:r>
-        <w:t xml:space="preserve">roductive </w:t>
-      </w:r>
-      <w:r>
-        <w:t>A</w:t>
-      </w:r>
-      <w:r>
-        <w:t>uthors of HSR-</w:t>
-      </w:r>
-      <w:r>
-        <w:t>R</w:t>
-      </w:r>
-      <w:r>
-        <w:t xml:space="preserve">elated </w:t>
-      </w:r>
-      <w:r>
-        <w:t>A</w:t>
-      </w:r>
-      <w:r>
-        <w:t>rticles</w:t>
-      </w:r>
-      <w:r>
-        <w:t xml:space="preserve">” in </w:t>
-      </w:r>
-    </w:p>
-    <w:p>
-      <w:pPr>
-        <w:pStyle w:val="Default"/>
-        <w:spacing w:after="120"/>
-        <w:ind w:left="360"/>
-        <w:jc w:val="both"/>
-      </w:pPr>
-      <w:r>
-        <w:t xml:space="preserve">Chen, X., &amp; Liu, Y. (2020). Visualization analysis of high-speed railway research based on </w:t>
-      </w:r>
-      <w:proofErr w:type="spellStart"/>
-      <w:r>
-        <w:t>CiteSpace</w:t>
-      </w:r>
-      <w:proofErr w:type="spellEnd"/>
-      <w:r>
-        <w:t>. </w:t>
-      </w:r>
-      <w:r>
-        <w:rPr>
-          <w:i/>
-        </w:rPr>
-        <w:t>Transport Policy</w:t>
-      </w:r>
-      <w:r>
-        <w:t>, 85, 1-17.</w:t>
-      </w:r>
-    </w:p>
-    <w:p>
-      <w:pPr>
-        <w:pStyle w:val="Default"/>
-        <w:numPr>
-          <w:ilvl w:val="0"/>
-          <w:numId w:val="18"/>
-        </w:numPr>
-        <w:spacing w:after="120"/>
-        <w:jc w:val="both"/>
-        <w:rPr>
-          <w:color w:val="auto"/>
-        </w:rPr>
-      </w:pPr>
-      <w:r>
-        <w:rPr>
-          <w:color w:val="auto"/>
-        </w:rPr>
-        <w:t>“Top 9 Core Authors in Aviation Research” in</w:t>
-      </w:r>
-    </w:p>
-    <w:p>
-      <w:pPr>
-        <w:pStyle w:val="Default"/>
-        <w:spacing w:after="120"/>
-        <w:ind w:left="360"/>
-        <w:jc w:val="both"/>
-      </w:pPr>
-      <w:r>
-        <w:t xml:space="preserve">Wang, F., Huang, J., </w:t>
-      </w:r>
-      <w:r>
-        <w:t>&amp;</w:t>
-      </w:r>
-      <w:r>
-        <w:t xml:space="preserve"> Han, Y. (2018). </w:t>
-      </w:r>
-      <w:r>
-        <w:t xml:space="preserve">How Aviation and Maritime Research Connect or Differ from Each Other? </w:t>
-      </w:r>
-      <w:r>
-        <w:t xml:space="preserve">Working paper, Sun Yat-sen University. </w:t>
-      </w:r>
+        <w:t xml:space="preserve">International policy evidence. The European Commission's 2026 EU ETS impact assessment cited Kang, Liao, Jiang and D'Alfonso's synthetic-control evaluation in its aviation analysis (p. 236); the OECD's 2025 systematic ex-post climate-policy review included the same study in its transport-sector evidence base (pp. 86–87). </w:t>
+      </w:r>
+      <w:hyperlink r:id="rId10">
+        <w:r>
+          <w:rPr>
+            <w:color w:val="0563C1"/>
+            <w:u w:val="single"/>
+          </w:rPr>
+          <w:t>European Commissio</w:t>
+        </w:r>
+        <w:r>
+          <w:rPr>
+            <w:color w:val="0563C1"/>
+            <w:u w:val="single"/>
+          </w:rPr>
+          <w:t>n</w:t>
+        </w:r>
+        <w:r>
+          <w:rPr>
+            <w:color w:val="0563C1"/>
+            <w:u w:val="single"/>
+          </w:rPr>
+          <w:t xml:space="preserve"> record</w:t>
+        </w:r>
+      </w:hyperlink>
     </w:p>
     <w:p>
       <w:pPr>
@@ -4301,6 +4293,7 @@
           <w:sz w:val="24"/>
           <w:szCs w:val="24"/>
         </w:rPr>
+        <w:lastRenderedPageBreak/>
         <w:t xml:space="preserve">*Zhang, J., Xiao, J., Wang, K., </w:t>
       </w:r>
       <w:proofErr w:type="spellStart"/>
@@ -4890,15 +4883,7 @@
           <w:rFonts w:ascii="Times New Roman" w:hAnsi="Times New Roman"/>
           <w:i/>
         </w:rPr>
-        <w:t xml:space="preserve">Transportation Research Part A: </w:t>
-      </w:r>
-      <w:r>
-        <w:rPr>
-          <w:rFonts w:ascii="Times New Roman" w:hAnsi="Times New Roman"/>
-          <w:i/>
-        </w:rPr>
-        <w:lastRenderedPageBreak/>
-        <w:t>Policy and Practice</w:t>
+        <w:t>Transportation Research Part A: Policy and Practice</w:t>
       </w:r>
       <w:r>
         <w:rPr>
@@ -6133,7 +6118,15 @@
           <w:rFonts w:ascii="Times New Roman" w:hAnsi="Times New Roman"/>
           <w:i/>
         </w:rPr>
-        <w:t>Transportation Research Part A: Policy and Practice</w:t>
+        <w:t xml:space="preserve">Transportation Research Part A: Policy and </w:t>
+      </w:r>
+      <w:r>
+        <w:rPr>
+          <w:rFonts w:ascii="Times New Roman" w:hAnsi="Times New Roman"/>
+          <w:i/>
+        </w:rPr>
+        <w:lastRenderedPageBreak/>
+        <w:t>Practice</w:t>
       </w:r>
       <w:r>
         <w:rPr>
@@ -6932,7 +6925,6 @@
           <w:i/>
           <w:iCs/>
         </w:rPr>
-        <w:lastRenderedPageBreak/>
         <w:t>Journal of</w:t>
       </w:r>
       <w:r>
@@ -8062,6 +8054,7 @@
         </w:rPr>
       </w:pPr>
       <w:r>
+        <w:lastRenderedPageBreak/>
         <w:t>^</w:t>
       </w:r>
       <w:r>
@@ -8646,7 +8639,6 @@
         <w:rPr>
           <w:i/>
         </w:rPr>
-        <w:lastRenderedPageBreak/>
         <w:t>Transportation Research Part E: Logistics and Transportation Review</w:t>
       </w:r>
       <w:r>
@@ -9529,6 +9521,7 @@
         <w:jc w:val="both"/>
       </w:pPr>
       <w:r>
+        <w:lastRenderedPageBreak/>
         <w:t>^*</w:t>
       </w:r>
       <w:r>
@@ -10353,15 +10346,7 @@
           <w:b/>
           <w:lang w:bidi="en-US"/>
         </w:rPr>
-        <w:t xml:space="preserve">; </w:t>
-      </w:r>
-      <w:r>
-        <w:rPr>
-          <w:b/>
-          <w:lang w:bidi="en-US"/>
-        </w:rPr>
-        <w:lastRenderedPageBreak/>
-        <w:t>ABS Grade 2; ABDC Grade A; JCR Q1; FMS Grade A</w:t>
+        <w:t>; ABS Grade 2; ABDC Grade A; JCR Q1; FMS Grade A</w:t>
       </w:r>
       <w:r>
         <w:rPr>
@@ -11352,7 +11337,15 @@
           <w:rFonts w:ascii="Times New Roman,Bold" w:hAnsi="Times New Roman,Bold"/>
           <w:lang w:val="en-CA"/>
         </w:rPr>
-        <w:t>Competition in Cargo and Passenger between High-Speed Rail and Airlines—Considering the Vertical Structure of Transportation</w:t>
+        <w:t xml:space="preserve">Competition in Cargo and Passenger between High-Speed Rail and Airlines—Considering the Vertical Structure of </w:t>
+      </w:r>
+      <w:r>
+        <w:rPr>
+          <w:rFonts w:ascii="Times New Roman,Bold" w:hAnsi="Times New Roman,Bold"/>
+          <w:lang w:val="en-CA"/>
+        </w:rPr>
+        <w:lastRenderedPageBreak/>
+        <w:t>Transportation</w:t>
       </w:r>
       <w:r>
         <w:rPr>
@@ -12083,14 +12076,7 @@
         <w:rPr>
           <w:b/>
         </w:rPr>
-        <w:t xml:space="preserve"> (IF: 7.041; ABS Grade 3; ABDC Grade A; </w:t>
-      </w:r>
-      <w:r>
-        <w:rPr>
-          <w:b/>
-        </w:rPr>
-        <w:lastRenderedPageBreak/>
-        <w:t>JCR Q1; FMS Grade B)</w:t>
+        <w:t xml:space="preserve"> (IF: 7.041; ABS Grade 3; ABDC Grade A; JCR Q1; FMS Grade B)</w:t>
       </w:r>
     </w:p>
     <w:p>
@@ -13149,7 +13135,11 @@
         <w:t>Risk Analysis</w:t>
       </w:r>
       <w:r>
-        <w:t xml:space="preserve">, 43(8), 1557-1571. </w:t>
+        <w:t xml:space="preserve">, </w:t>
+      </w:r>
+      <w:r>
+        <w:lastRenderedPageBreak/>
+        <w:t xml:space="preserve">43(8), 1557-1571. </w:t>
       </w:r>
       <w:r>
         <w:rPr>
@@ -13705,11 +13695,7 @@
         <w:t>Impact of High-speed Rail</w:t>
       </w:r>
       <w:r>
-        <w:t xml:space="preserve"> </w:t>
-      </w:r>
-      <w:r>
-        <w:lastRenderedPageBreak/>
-        <w:t xml:space="preserve">Competition on Airlines’ On-Time Performance”, </w:t>
+        <w:t xml:space="preserve"> Competition on Airlines’ On-Time Performance”, </w:t>
       </w:r>
       <w:r>
         <w:rPr>
@@ -14642,6 +14628,7 @@
         <w:rPr>
           <w:rFonts w:ascii="Times New Roman" w:hAnsi="Times New Roman"/>
         </w:rPr>
+        <w:lastRenderedPageBreak/>
         <w:t>^</w:t>
       </w:r>
       <w:r>
@@ -15201,7 +15188,6 @@
         <w:jc w:val="both"/>
       </w:pPr>
       <w:r>
-        <w:lastRenderedPageBreak/>
         <w:t>^</w:t>
       </w:r>
       <w:proofErr w:type="spellStart"/>
@@ -16393,7 +16379,15 @@
           <w:b/>
           <w:lang w:bidi="en-US"/>
         </w:rPr>
-        <w:t>; FMS Grade B</w:t>
+        <w:t xml:space="preserve">; FMS Grade </w:t>
+      </w:r>
+      <w:r>
+        <w:rPr>
+          <w:b/>
+          <w:lang w:bidi="en-US"/>
+        </w:rPr>
+        <w:lastRenderedPageBreak/>
+        <w:t>B</w:t>
       </w:r>
       <w:r>
         <w:rPr>
@@ -17069,7 +17063,6 @@
         <w:rPr>
           <w:b/>
         </w:rPr>
-        <w:lastRenderedPageBreak/>
         <w:t>*</w:t>
       </w:r>
       <w:bookmarkStart w:id="18" w:name="OLE_LINK5"/>
@@ -18229,7 +18222,14 @@
         <w:rPr>
           <w:i/>
         </w:rPr>
-        <w:t>Journal of Business Ethics</w:t>
+        <w:t xml:space="preserve">Journal </w:t>
+      </w:r>
+      <w:r>
+        <w:rPr>
+          <w:i/>
+        </w:rPr>
+        <w:lastRenderedPageBreak/>
+        <w:t>of Business Ethics</w:t>
       </w:r>
       <w:r>
         <w:t xml:space="preserve">, </w:t>
@@ -19047,11 +19047,7 @@
         <w:t xml:space="preserve"> C.</w:t>
       </w:r>
       <w:r>
-        <w:t xml:space="preserve">, and A. Zhang (2016) “Airline Network Choice and Market Coverage under </w:t>
-      </w:r>
-      <w:r>
-        <w:lastRenderedPageBreak/>
-        <w:t xml:space="preserve">High-Speed Rail Competition”, </w:t>
+        <w:t xml:space="preserve">, and A. Zhang (2016) “Airline Network Choice and Market Coverage under High-Speed Rail Competition”, </w:t>
       </w:r>
       <w:r>
         <w:rPr>
@@ -20045,7 +20041,11 @@
         <w:t xml:space="preserve"> </w:t>
       </w:r>
       <w:r>
-        <w:t xml:space="preserve">and Y. Wan (2013) “Airport Pricing, Concession Revenues and Passenger Types”, </w:t>
+        <w:t xml:space="preserve">and Y. Wan (2013) “Airport Pricing, Concession Revenues and </w:t>
+      </w:r>
+      <w:r>
+        <w:lastRenderedPageBreak/>
+        <w:t xml:space="preserve">Passenger Types”, </w:t>
       </w:r>
       <w:bookmarkStart w:id="35" w:name="OLE_LINK64"/>
       <w:bookmarkStart w:id="36" w:name="OLE_LINK65"/>
@@ -20459,7 +20459,6 @@
         <w:rPr>
           <w:color w:val="auto"/>
         </w:rPr>
-        <w:lastRenderedPageBreak/>
         <w:t>Afenyo</w:t>
       </w:r>
       <w:proofErr w:type="spellEnd"/>
@@ -21140,6 +21139,7 @@
         <w:jc w:val="both"/>
       </w:pPr>
       <w:r>
+        <w:lastRenderedPageBreak/>
         <w:t xml:space="preserve">Amount: </w:t>
       </w:r>
       <w:r>
@@ -21504,7 +21504,6 @@
         <w:jc w:val="both"/>
       </w:pPr>
       <w:r>
-        <w:lastRenderedPageBreak/>
         <w:t>SSHRC Insight Development Grant (</w:t>
       </w:r>
       <w:bookmarkStart w:id="37" w:name="OLE_LINK38"/>
@@ -22001,6 +22000,7 @@
         <w:jc w:val="both"/>
       </w:pPr>
       <w:r>
+        <w:lastRenderedPageBreak/>
         <w:t>Amount: CAD 6</w:t>
       </w:r>
       <w:r>
@@ -22363,7 +22363,6 @@
         <w:rPr>
           <w:color w:val="auto"/>
         </w:rPr>
-        <w:lastRenderedPageBreak/>
         <w:t xml:space="preserve">Amount: RMB </w:t>
       </w:r>
       <w:r>
@@ -22814,6 +22813,7 @@
         <w:jc w:val="both"/>
       </w:pPr>
       <w:r>
+        <w:lastRenderedPageBreak/>
         <w:t xml:space="preserve">Project Title: </w:t>
       </w:r>
       <w:r>
@@ -23072,7 +23072,6 @@
         <w:t xml:space="preserve">ir </w:t>
       </w:r>
       <w:r>
-        <w:lastRenderedPageBreak/>
         <w:t>t</w:t>
       </w:r>
       <w:r>
@@ -23632,6 +23631,7 @@
               <w:jc w:val="both"/>
             </w:pPr>
             <w:r>
+              <w:lastRenderedPageBreak/>
               <w:t>For the paper “</w:t>
             </w:r>
             <w:r>
@@ -23677,6 +23677,7 @@
           </w:tcPr>
           <w:p>
             <w:r>
+              <w:lastRenderedPageBreak/>
               <w:t>2021</w:t>
             </w:r>
           </w:p>
@@ -23920,7 +23921,6 @@
               <w:jc w:val="both"/>
             </w:pPr>
             <w:r>
-              <w:lastRenderedPageBreak/>
               <w:t xml:space="preserve">Transport Institute, </w:t>
             </w:r>
             <w:r>
@@ -23936,7 +23936,6 @@
           </w:tcPr>
           <w:p>
             <w:r>
-              <w:lastRenderedPageBreak/>
               <w:t>2019</w:t>
             </w:r>
           </w:p>
@@ -24245,6 +24244,7 @@
               <w:jc w:val="both"/>
             </w:pPr>
             <w:r>
+              <w:lastRenderedPageBreak/>
               <w:t>For the paper “</w:t>
             </w:r>
             <w:r>
@@ -24260,6 +24260,7 @@
           </w:tcPr>
           <w:p>
             <w:r>
+              <w:lastRenderedPageBreak/>
               <w:t>2016</w:t>
             </w:r>
           </w:p>
@@ -24522,7 +24523,6 @@
               <w:jc w:val="both"/>
             </w:pPr>
             <w:r>
-              <w:lastRenderedPageBreak/>
               <w:t>Peking University</w:t>
             </w:r>
           </w:p>
@@ -24860,6 +24860,7 @@
           <w:b/>
           <w:i/>
         </w:rPr>
+        <w:lastRenderedPageBreak/>
         <w:t>Conference Presentations</w:t>
       </w:r>
     </w:p>
@@ -25338,7 +25339,6 @@
         <w:rPr>
           <w:i/>
         </w:rPr>
-        <w:lastRenderedPageBreak/>
         <w:t>25</w:t>
       </w:r>
       <w:r>
@@ -25994,6 +25994,7 @@
         <w:rPr>
           <w:i/>
         </w:rPr>
+        <w:lastRenderedPageBreak/>
         <w:t>2</w:t>
       </w:r>
       <w:r>
@@ -26294,11 +26295,7 @@
         <w:t>UMTI-Asper-SMU Workshop on Transportation, Logistics, and Regional Development</w:t>
       </w:r>
       <w:r>
-        <w:t xml:space="preserve">, 22 </w:t>
-      </w:r>
-      <w:r>
-        <w:lastRenderedPageBreak/>
-        <w:t>September 2017, Winnipeg, Canada (invited speaker). Topic: ‘Strategic Trade-Off Between Vessel Delay and Schedule Recovery: An Empirical Analysis of Container Liner Shipping’.</w:t>
+        <w:t>, 22 September 2017, Winnipeg, Canada (invited speaker). Topic: ‘Strategic Trade-Off Between Vessel Delay and Schedule Recovery: An Empirical Analysis of Container Liner Shipping’.</w:t>
       </w:r>
     </w:p>
     <w:p>
@@ -26923,6 +26920,7 @@
         <w:rPr>
           <w:i/>
         </w:rPr>
+        <w:lastRenderedPageBreak/>
         <w:t>Global Port Research Alliance Conference on “Port and Logistics Connectivity”</w:t>
       </w:r>
       <w:r>
@@ -27148,15 +27146,7 @@
           <w:bCs/>
           <w:lang w:val="en-CA"/>
         </w:rPr>
-        <w:t xml:space="preserve">The Impact of Sustainable Aviation Fuel Quota Mandates on the Optimal On-Airport Fuel Facility </w:t>
-      </w:r>
-      <w:r>
-        <w:rPr>
-          <w:bCs/>
-          <w:lang w:val="en-CA"/>
-        </w:rPr>
-        <w:lastRenderedPageBreak/>
-        <w:t>Ownership</w:t>
+        <w:t>The Impact of Sustainable Aviation Fuel Quota Mandates on the Optimal On-Airport Fuel Facility Ownership</w:t>
       </w:r>
       <w:r>
         <w:t>’.</w:t>
@@ -27780,6 +27770,7 @@
         <w:rPr>
           <w:lang w:val="en-CA"/>
         </w:rPr>
+        <w:lastRenderedPageBreak/>
         <w:t>Sustainable Aviation Fuel</w:t>
       </w:r>
       <w:r>
@@ -28260,11 +28251,7 @@
         <w:t>hina</w:t>
       </w:r>
       <w:r>
-        <w:t xml:space="preserve">. </w:t>
-      </w:r>
-      <w:r>
-        <w:lastRenderedPageBreak/>
-        <w:t>Topic: ‘</w:t>
+        <w:t>. Topic: ‘</w:t>
       </w:r>
       <w:r>
         <w:t>Competition between High-Speed Rail and Airlines: Considering both Passenger and Cargo</w:t>
@@ -28741,6 +28728,7 @@
           <w:b/>
           <w:i/>
         </w:rPr>
+        <w:lastRenderedPageBreak/>
         <w:t>C</w:t>
       </w:r>
       <w:r>
@@ -29170,7 +29158,6 @@
                 <w:rFonts w:eastAsia="MingLiU"/>
                 <w:kern w:val="22"/>
               </w:rPr>
-              <w:lastRenderedPageBreak/>
               <w:t xml:space="preserve">Highest </w:t>
             </w:r>
             <w:r>
@@ -29214,7 +29201,6 @@
                 <w:rFonts w:eastAsia="MingLiU" w:hint="eastAsia"/>
                 <w:kern w:val="22"/>
               </w:rPr>
-              <w:lastRenderedPageBreak/>
               <w:t>2019</w:t>
             </w:r>
           </w:p>
@@ -29950,6 +29936,7 @@
           <w:b/>
           <w:i/>
         </w:rPr>
+        <w:lastRenderedPageBreak/>
         <w:t>Consulting Projects</w:t>
       </w:r>
     </w:p>
@@ -30411,7 +30398,6 @@
         <w:rPr>
           <w:i/>
         </w:rPr>
-        <w:lastRenderedPageBreak/>
         <w:t>The 16</w:t>
       </w:r>
       <w:r>
@@ -31035,6 +31021,7 @@
         <w:rPr>
           <w:rFonts w:ascii="Times New Roman" w:hAnsi="Times New Roman"/>
         </w:rPr>
+        <w:lastRenderedPageBreak/>
         <w:t xml:space="preserve">Ad Hoc </w:t>
       </w:r>
       <w:r>
@@ -32004,6 +31991,7 @@
         <w:rPr>
           <w:rFonts w:ascii="Times New Roman" w:hAnsi="Times New Roman"/>
         </w:rPr>
+        <w:lastRenderedPageBreak/>
         <w:t>Master of Supply Chain Management Program</w:t>
       </w:r>
       <w:r>
@@ -32405,7 +32393,6 @@
         <w:rPr>
           <w:rFonts w:ascii="Times New Roman" w:hAnsi="Times New Roman"/>
         </w:rPr>
-        <w:lastRenderedPageBreak/>
         <w:t xml:space="preserve">Supply Chain Management </w:t>
       </w:r>
       <w:r>
@@ -32869,6 +32856,7 @@
         <w:rPr>
           <w:rFonts w:ascii="Times New Roman" w:hAnsi="Times New Roman"/>
         </w:rPr>
+        <w:lastRenderedPageBreak/>
         <w:t>Jiayi</w:t>
       </w:r>
       <w:r>
@@ -33270,7 +33258,6 @@
         <w:rPr>
           <w:rFonts w:ascii="Times New Roman" w:hAnsi="Times New Roman"/>
         </w:rPr>
-        <w:lastRenderedPageBreak/>
         <w:t>Xingchen Guo (2022-2025, University of International Business and Economics), MSc in Transportation Economics</w:t>
       </w:r>
     </w:p>
@@ -33936,6 +33923,7 @@
           <w:b/>
           <w:i/>
         </w:rPr>
+        <w:lastRenderedPageBreak/>
         <w:t>Graduate Student Supervision Awards</w:t>
       </w:r>
       <w:r>
@@ -34437,7 +34425,7 @@
         </w:rPr>
         <w:t xml:space="preserve">. </w:t>
       </w:r>
-      <w:hyperlink r:id="rId9" w:tgtFrame="_blank" w:tooltip="原始 URL: https://www.stheadline.com/society/3593409。如果你信任此链接, 请单击或点击。" w:history="1">
+      <w:hyperlink r:id="rId11" w:tgtFrame="_blank" w:tooltip="原始 URL: https://www.stheadline.com/society/3593409。如果你信任此链接, 请单击或点击。" w:history="1">
         <w:r>
           <w:rPr>
             <w:rStyle w:val="Hyperlink"/>
@@ -34478,7 +34466,7 @@
         </w:rPr>
         <w:t xml:space="preserve">. </w:t>
       </w:r>
-      <w:hyperlink r:id="rId10" w:anchor="HK-bets-big-on-generating-secondhand-aircraft-parts-2026-05-08" w:history="1">
+      <w:hyperlink r:id="rId12" w:anchor="HK-bets-big-on-generating-secondhand-aircraft-parts-2026-05-08" w:history="1">
         <w:r>
           <w:rPr>
             <w:rStyle w:val="Hyperlink"/>
@@ -34624,7 +34612,7 @@
         </w:rPr>
         <w:t xml:space="preserve">. </w:t>
       </w:r>
-      <w:hyperlink r:id="rId11" w:history="1">
+      <w:hyperlink r:id="rId13" w:history="1">
         <w:r>
           <w:rPr>
             <w:rStyle w:val="Hyperlink"/>
@@ -34754,6 +34742,7 @@
         <w:rPr>
           <w:rFonts w:ascii="Times New Roman" w:hAnsi="Times New Roman"/>
         </w:rPr>
+        <w:lastRenderedPageBreak/>
         <w:t xml:space="preserve">CGTN (China Global Television Network) on </w:t>
       </w:r>
       <w:r>
@@ -35169,7 +35158,6 @@
         <w:rPr>
           <w:rFonts w:ascii="Times New Roman" w:hAnsi="Times New Roman"/>
         </w:rPr>
-        <w:lastRenderedPageBreak/>
         <w:t>CGTN</w:t>
       </w:r>
       <w:r>
@@ -35300,7 +35288,7 @@
           <w:rFonts w:ascii="Times New Roman" w:hAnsi="Times New Roman"/>
         </w:rPr>
       </w:pPr>
-      <w:hyperlink r:id="rId12" w:history="1">
+      <w:hyperlink r:id="rId14" w:history="1">
         <w:r>
           <w:rPr>
             <w:rStyle w:val="Hyperlink"/>
@@ -35338,7 +35326,7 @@
           <w:rFonts w:ascii="Times New Roman" w:hAnsi="Times New Roman"/>
         </w:rPr>
       </w:pPr>
-      <w:hyperlink r:id="rId13" w:history="1">
+      <w:hyperlink r:id="rId15" w:history="1">
         <w:r>
           <w:rPr>
             <w:rStyle w:val="Hyperlink"/>
@@ -35569,7 +35557,7 @@
           <w:rFonts w:ascii="Times New Roman" w:hAnsi="Times New Roman"/>
         </w:rPr>
       </w:pPr>
-      <w:hyperlink r:id="rId14" w:history="1">
+      <w:hyperlink r:id="rId16" w:history="1">
         <w:r>
           <w:rPr>
             <w:rStyle w:val="Hyperlink"/>
@@ -35611,8 +35599,8 @@
       </w:r>
     </w:p>
     <w:sectPr>
-      <w:footerReference w:type="even" r:id="rId15"/>
-      <w:footerReference w:type="default" r:id="rId16"/>
+      <w:footerReference w:type="even" r:id="rId17"/>
+      <w:footerReference w:type="default" r:id="rId18"/>
       <w:pgSz w:w="12240" w:h="15840"/>
       <w:pgMar w:top="1440" w:right="1440" w:bottom="1440" w:left="1440" w:header="708" w:footer="708" w:gutter="0"/>
       <w:cols w:space="708"/>

</xml_diff>